<commit_message>
docs: update document author metadata to Arun Pandian (arunpandi47777@gmail.com)
</commit_message>
<xml_diff>
--- a/Week 2/EDA_and_Visualization_Framework.docx
+++ b/Week 2/EDA_and_Visualization_Framework.docx
@@ -31,12 +31,12 @@
       <w:r>
         <w:rPr>
           <w:i/>
-          <w:color w:val="7F8C8D"/>
-          <w:sz w:val="20"/>
+          <w:color w:val="1B365D"/>
+          <w:sz w:val="21"/>
         </w:rPr>
-        <w:t>A Universal, Multi-Phase Analytical Methodology for Tabular, Structured, and Complex Datasets</w:t>
+        <w:t>Author: Arun Pandian | Email: arunpandi47777@gmail.com</w:t>
         <w:br/>
-        <w:t>Author: Data Science &amp; AI Research Team | Status: Production Blueprint</w:t>
+        <w:t>Track: Data Science &amp; AI Research | Status: Production Blueprint</w:t>
       </w:r>
     </w:p>
     <w:p>

</xml_diff>